<commit_message>
All the work I have did so far
</commit_message>
<xml_diff>
--- a/reports/Weekly_reports.docx
+++ b/reports/Weekly_reports.docx
@@ -3164,7 +3164,7 @@
           <w:rStyle w:val="s1"/>
           <w:noProof/>
         </w:rPr>
-        <w:pict w14:anchorId="10A82CFA">
+        <w:pict w14:anchorId="67191D0D">
           <v:rect id="_x0000_i1025" alt="" style="width:339.75pt;height:.05pt;mso-width-percent:0;mso-height-percent:0;mso-width-percent:0;mso-height-percent:0" o:hrpct="726" o:hralign="center" o:hrstd="t" o:hr="t" fillcolor="#a0a0a0" stroked="f"/>
         </w:pict>
       </w:r>
@@ -5838,6 +5838,51 @@
           <w:sz w:val="21"/>
         </w:rPr>
         <w:t>This represents a major systems-integration step toward full 3D localization, even though final visual odometry robustness still requires additional testing and tuning.</w:t>
+      </w:r>
+    </w:p>
+    <w:p/>
+    <w:p>
+      <w:pPr>
+        <w:spacing w:after="0" w:line="240" w:lineRule="auto"/>
+        <w:rPr>
+          <w:rFonts w:ascii="Helvetica Neue" w:eastAsia="Times New Roman" w:hAnsi="Helvetica Neue" w:cs="Times New Roman"/>
+          <w:color w:val="000000"/>
+          <w:sz w:val="29"/>
+          <w:szCs w:val="29"/>
+          <w:lang w:val="en-CA"/>
+        </w:rPr>
+      </w:pPr>
+      <w:r>
+        <w:rPr>
+          <w:rFonts w:ascii="Helvetica Neue" w:eastAsia="Times New Roman" w:hAnsi="Helvetica Neue" w:cs="Times New Roman"/>
+          <w:color w:val="000000"/>
+          <w:sz w:val="29"/>
+          <w:szCs w:val="29"/>
+          <w:lang w:val="en-CA"/>
+        </w:rPr>
+        <w:t>Astar, rrt algorithm for movement </w:t>
+      </w:r>
+    </w:p>
+    <w:p>
+      <w:pPr>
+        <w:spacing w:after="0" w:line="240" w:lineRule="auto"/>
+        <w:rPr>
+          <w:rFonts w:ascii="Helvetica Neue" w:eastAsia="Times New Roman" w:hAnsi="Helvetica Neue" w:cs="Times New Roman"/>
+          <w:color w:val="000000"/>
+          <w:sz w:val="29"/>
+          <w:szCs w:val="29"/>
+          <w:lang w:val="en-CA"/>
+        </w:rPr>
+      </w:pPr>
+      <w:r>
+        <w:rPr>
+          <w:rFonts w:ascii="Helvetica Neue" w:eastAsia="Times New Roman" w:hAnsi="Helvetica Neue" w:cs="Times New Roman"/>
+          <w:color w:val="000000"/>
+          <w:sz w:val="29"/>
+          <w:szCs w:val="29"/>
+          <w:lang w:val="en-CA"/>
+        </w:rPr>
+        <w:t>one of the thing to create is the flow chart of total process for what i'm doing </w:t>
       </w:r>
     </w:p>
     <w:p/>
@@ -23522,6 +23567,11 @@
     <w:basedOn w:val="DefaultParagraphFont"/>
     <w:rsid w:val="008E3DA2"/>
   </w:style>
+  <w:style w:type="character" w:customStyle="1" w:styleId="apple-converted-space">
+    <w:name w:val="apple-converted-space"/>
+    <w:basedOn w:val="DefaultParagraphFont"/>
+    <w:rsid w:val="00D10289"/>
+  </w:style>
 </w:styles>
 </file>
 

</xml_diff>